<commit_message>
nmv 23 09 2026
</commit_message>
<xml_diff>
--- a/TS-Kramam/TS-5.1/TS 5.1 Malayalam Krama Paatam Corrections.docx
+++ b/TS-Kramam/TS-5.1/TS 5.1 Malayalam Krama Paatam Corrections.docx
@@ -2,6 +2,605 @@
 <file path=word/document.xml><?xml version="1.0" encoding="utf-8"?>
 <w:document xmlns:wpc="http://schemas.microsoft.com/office/word/2010/wordprocessingCanvas" xmlns:cx="http://schemas.microsoft.com/office/drawing/2014/chartex" xmlns:cx1="http://schemas.microsoft.com/office/drawing/2015/9/8/chartex" xmlns:cx2="http://schemas.microsoft.com/office/drawing/2015/10/21/chartex" xmlns:cx3="http://schemas.microsoft.com/office/drawing/2016/5/9/chartex" xmlns:cx4="http://schemas.microsoft.com/office/drawing/2016/5/10/chartex" xmlns:cx5="http://schemas.microsoft.com/office/drawing/2016/5/11/chartex" xmlns:cx6="http://schemas.microsoft.com/office/drawing/2016/5/12/chartex" xmlns:cx7="http://schemas.microsoft.com/office/drawing/2016/5/13/chartex" xmlns:cx8="http://schemas.microsoft.com/office/drawing/2016/5/14/chartex" xmlns:mc="http://schemas.openxmlformats.org/markup-compatibility/2006" xmlns:aink="http://schemas.microsoft.com/office/drawing/2016/ink" xmlns:am3d="http://schemas.microsoft.com/office/drawing/2017/model3d" xmlns:o="urn:schemas-microsoft-com:office:office" xmlns:oel="http://schemas.microsoft.com/office/2019/extlst" xmlns:r="http://schemas.openxmlformats.org/officeDocument/2006/relationships" xmlns:m="http://schemas.openxmlformats.org/officeDocument/2006/math" xmlns:v="urn:schemas-microsoft-com:vml" xmlns:wp14="http://schemas.microsoft.com/office/word/2010/wordprocessingDrawing" xmlns:wp="http://schemas.openxmlformats.org/drawingml/2006/wordprocessingDrawing" xmlns:w10="urn:schemas-microsoft-com:office:word" xmlns:w="http://schemas.openxmlformats.org/wordprocessingml/2006/main" xmlns:w14="http://schemas.microsoft.com/office/word/2010/wordml" xmlns:w15="http://schemas.microsoft.com/office/word/2012/wordml" xmlns:w16cex="http://schemas.microsoft.com/office/word/2018/wordml/cex" xmlns:w16cid="http://schemas.microsoft.com/office/word/2016/wordml/cid" xmlns:w16="http://schemas.microsoft.com/office/word/2018/wordml" xmlns:w16du="http://schemas.microsoft.com/office/word/2023/wordml/word16du" xmlns:w16sdtdh="http://schemas.microsoft.com/office/word/2020/wordml/sdtdatahash" xmlns:w16sdtfl="http://schemas.microsoft.com/office/word/2024/wordml/sdtformatlock" xmlns:w16se="http://schemas.microsoft.com/office/word/2015/wordml/symex" xmlns:wpg="http://schemas.microsoft.com/office/word/2010/wordprocessingGroup" xmlns:wpi="http://schemas.microsoft.com/office/word/2010/wordprocessingInk" xmlns:wne="http://schemas.microsoft.com/office/word/2006/wordml" xmlns:wps="http://schemas.microsoft.com/office/word/2010/wordprocessingShape" mc:Ignorable="w14 w15 w16se w16cid w16 w16cex w16sdtdh w16sdtfl w16du wp14">
   <w:body>
+    <w:p>
+      <w:pPr>
+        <w:jc w:val="center"/>
+        <w:rPr>
+          <w:b/>
+          <w:bCs/>
+          <w:sz w:val="32"/>
+          <w:szCs w:val="32"/>
+          <w:u w:val="single"/>
+        </w:rPr>
+      </w:pPr>
+      <w:r>
+        <w:rPr>
+          <w:b/>
+          <w:bCs/>
+          <w:sz w:val="32"/>
+          <w:szCs w:val="32"/>
+          <w:u w:val="single"/>
+        </w:rPr>
+        <w:t xml:space="preserve">TS </w:t>
+      </w:r>
+      <w:r>
+        <w:rPr>
+          <w:b/>
+          <w:bCs/>
+          <w:sz w:val="32"/>
+          <w:szCs w:val="32"/>
+          <w:u w:val="single"/>
+        </w:rPr>
+        <w:t>Krama</w:t>
+      </w:r>
+      <w:r>
+        <w:rPr>
+          <w:b/>
+          <w:bCs/>
+          <w:sz w:val="32"/>
+          <w:szCs w:val="32"/>
+          <w:u w:val="single"/>
+        </w:rPr>
+        <w:t xml:space="preserve"> Paatam – TS </w:t>
+      </w:r>
+      <w:r>
+        <w:rPr>
+          <w:b/>
+          <w:bCs/>
+          <w:sz w:val="32"/>
+          <w:szCs w:val="32"/>
+          <w:u w:val="single"/>
+        </w:rPr>
+        <w:t>5.1 Malayalam</w:t>
+      </w:r>
+      <w:r>
+        <w:rPr>
+          <w:b/>
+          <w:bCs/>
+          <w:sz w:val="32"/>
+          <w:szCs w:val="32"/>
+          <w:u w:val="single"/>
+        </w:rPr>
+        <w:t xml:space="preserve"> Corrections –</w:t>
+      </w:r>
+      <w:r>
+        <w:rPr>
+          <w:b/>
+          <w:bCs/>
+          <w:sz w:val="32"/>
+          <w:szCs w:val="32"/>
+          <w:u w:val="single"/>
+        </w:rPr>
+        <w:t xml:space="preserve"> </w:t>
+      </w:r>
+      <w:r>
+        <w:rPr>
+          <w:b/>
+          <w:bCs/>
+          <w:sz w:val="32"/>
+          <w:szCs w:val="32"/>
+          <w:u w:val="single"/>
+        </w:rPr>
+        <w:t xml:space="preserve">Observed till </w:t>
+      </w:r>
+      <w:r>
+        <w:rPr>
+          <w:b/>
+          <w:bCs/>
+          <w:sz w:val="32"/>
+          <w:szCs w:val="32"/>
+          <w:highlight w:val="red"/>
+          <w:u w:val="single"/>
+        </w:rPr>
+        <w:t>?????</w:t>
+      </w:r>
+    </w:p>
+    <w:p>
+      <w:pPr>
+        <w:spacing w:before="0" w:line="240" w:lineRule="auto"/>
+        <w:jc w:val="center"/>
+        <w:rPr>
+          <w:b/>
+          <w:bCs/>
+        </w:rPr>
+      </w:pPr>
+      <w:r>
+        <w:rPr>
+          <w:b/>
+          <w:bCs/>
+        </w:rPr>
+        <w:t>(ignore those which are already incorporated in your book’s version and date)</w:t>
+      </w:r>
+    </w:p>
+    <w:tbl>
+      <w:tblPr>
+        <w:tblW w:w="14395" w:type="dxa"/>
+        <w:tblInd w:w="-792" w:type="dxa"/>
+        <w:tblBorders>
+          <w:top w:val="single" w:sz="4" w:space="0" w:color="000000"/>
+          <w:left w:val="single" w:sz="4" w:space="0" w:color="000000"/>
+          <w:bottom w:val="single" w:sz="4" w:space="0" w:color="000000"/>
+          <w:right w:val="single" w:sz="4" w:space="0" w:color="000000"/>
+          <w:insideH w:val="single" w:sz="4" w:space="0" w:color="000000"/>
+          <w:insideV w:val="single" w:sz="4" w:space="0" w:color="000000"/>
+        </w:tblBorders>
+        <w:tblLook w:val="04A0" w:firstRow="1" w:lastRow="0" w:firstColumn="1" w:lastColumn="0" w:noHBand="0" w:noVBand="1"/>
+      </w:tblPr>
+      <w:tblGrid>
+        <w:gridCol w:w="3906"/>
+        <w:gridCol w:w="5103"/>
+        <w:gridCol w:w="5386"/>
+      </w:tblGrid>
+      <w:tr>
+        <w:tc>
+          <w:tcPr>
+            <w:tcW w:w="3906" w:type="dxa"/>
+          </w:tcPr>
+          <w:p>
+            <w:pPr>
+              <w:spacing w:before="0" w:line="240" w:lineRule="auto"/>
+              <w:jc w:val="center"/>
+              <w:rPr>
+                <w:sz w:val="32"/>
+                <w:szCs w:val="32"/>
+              </w:rPr>
+            </w:pPr>
+            <w:r>
+              <w:rPr>
+                <w:sz w:val="32"/>
+                <w:szCs w:val="32"/>
+              </w:rPr>
+              <w:t>Section, Paragraph</w:t>
+            </w:r>
+          </w:p>
+          <w:p>
+            <w:pPr>
+              <w:spacing w:before="0" w:line="240" w:lineRule="auto"/>
+              <w:jc w:val="center"/>
+              <w:rPr>
+                <w:sz w:val="32"/>
+                <w:szCs w:val="32"/>
+              </w:rPr>
+            </w:pPr>
+            <w:r>
+              <w:rPr>
+                <w:sz w:val="32"/>
+                <w:szCs w:val="32"/>
+              </w:rPr>
+              <w:t>Reference</w:t>
+            </w:r>
+          </w:p>
+        </w:tc>
+        <w:tc>
+          <w:tcPr>
+            <w:tcW w:w="5103" w:type="dxa"/>
+          </w:tcPr>
+          <w:p>
+            <w:pPr>
+              <w:spacing w:before="0" w:line="240" w:lineRule="auto"/>
+              <w:jc w:val="center"/>
+              <w:rPr>
+                <w:sz w:val="32"/>
+                <w:szCs w:val="32"/>
+              </w:rPr>
+            </w:pPr>
+            <w:r>
+              <w:rPr>
+                <w:sz w:val="32"/>
+                <w:szCs w:val="32"/>
+              </w:rPr>
+              <w:t>As Printed</w:t>
+            </w:r>
+          </w:p>
+        </w:tc>
+        <w:tc>
+          <w:tcPr>
+            <w:tcW w:w="5386" w:type="dxa"/>
+          </w:tcPr>
+          <w:p>
+            <w:pPr>
+              <w:spacing w:before="0" w:line="240" w:lineRule="auto"/>
+              <w:ind w:right="-18"/>
+              <w:jc w:val="center"/>
+              <w:rPr>
+                <w:sz w:val="32"/>
+                <w:szCs w:val="32"/>
+              </w:rPr>
+            </w:pPr>
+            <w:r>
+              <w:rPr>
+                <w:sz w:val="32"/>
+                <w:szCs w:val="32"/>
+              </w:rPr>
+              <w:t>To be read as or corrected as</w:t>
+            </w:r>
+          </w:p>
+        </w:tc>
+      </w:tr>
+      <w:tr>
+        <w:trPr>
+          <w:trHeight w:val="1104"/>
+        </w:trPr>
+        <w:tc>
+          <w:tcPr>
+            <w:tcW w:w="3906" w:type="dxa"/>
+          </w:tcPr>
+          <w:p>
+            <w:pPr>
+              <w:widowControl w:val="0"/>
+              <w:tabs>
+                <w:tab w:val="left" w:pos="993"/>
+              </w:tabs>
+              <w:autoSpaceDE w:val="0"/>
+              <w:autoSpaceDN w:val="0"/>
+              <w:adjustRightInd w:val="0"/>
+              <w:spacing w:before="0" w:line="240" w:lineRule="auto"/>
+              <w:ind w:right="297"/>
+              <w:rPr>
+                <w:rFonts w:cs="Arial"/>
+                <w:b/>
+                <w:color w:val="000000"/>
+                <w:sz w:val="28"/>
+                <w:szCs w:val="28"/>
+              </w:rPr>
+            </w:pPr>
+            <w:r>
+              <w:rPr>
+                <w:rFonts w:cs="Arial"/>
+                <w:b/>
+                <w:color w:val="000000"/>
+                <w:sz w:val="28"/>
+                <w:szCs w:val="28"/>
+              </w:rPr>
+              <w:t>T.S.5.1.</w:t>
+            </w:r>
+            <w:r>
+              <w:rPr>
+                <w:rFonts w:cs="Arial"/>
+                <w:b/>
+                <w:color w:val="000000"/>
+                <w:sz w:val="28"/>
+                <w:szCs w:val="28"/>
+              </w:rPr>
+              <w:t>9.3</w:t>
+            </w:r>
+            <w:r>
+              <w:rPr>
+                <w:rFonts w:cs="Arial"/>
+                <w:b/>
+                <w:color w:val="000000"/>
+                <w:sz w:val="28"/>
+                <w:szCs w:val="28"/>
+              </w:rPr>
+              <w:t xml:space="preserve"> – Kramam</w:t>
+            </w:r>
+          </w:p>
+          <w:p>
+            <w:pPr>
+              <w:widowControl w:val="0"/>
+              <w:tabs>
+                <w:tab w:val="left" w:pos="993"/>
+              </w:tabs>
+              <w:autoSpaceDE w:val="0"/>
+              <w:autoSpaceDN w:val="0"/>
+              <w:adjustRightInd w:val="0"/>
+              <w:spacing w:before="0" w:line="240" w:lineRule="auto"/>
+              <w:ind w:right="297"/>
+              <w:rPr>
+                <w:rFonts w:cs="Arial"/>
+                <w:b/>
+                <w:color w:val="000000"/>
+                <w:sz w:val="28"/>
+                <w:szCs w:val="28"/>
+                <w:lang w:val="it-IT"/>
+              </w:rPr>
+            </w:pPr>
+            <w:r>
+              <w:rPr>
+                <w:rFonts w:cs="Arial"/>
+                <w:b/>
+                <w:color w:val="000000"/>
+                <w:sz w:val="28"/>
+                <w:szCs w:val="28"/>
+                <w:lang w:val="it-IT"/>
+              </w:rPr>
+              <w:t xml:space="preserve">Krama Vaakyam No.– </w:t>
+            </w:r>
+            <w:r>
+              <w:rPr>
+                <w:rFonts w:cs="Arial"/>
+                <w:b/>
+                <w:color w:val="000000"/>
+                <w:sz w:val="28"/>
+                <w:szCs w:val="28"/>
+                <w:lang w:val="it-IT"/>
+              </w:rPr>
+              <w:t>14</w:t>
+            </w:r>
+          </w:p>
+          <w:p>
+            <w:pPr>
+              <w:widowControl w:val="0"/>
+              <w:tabs>
+                <w:tab w:val="left" w:pos="993"/>
+              </w:tabs>
+              <w:autoSpaceDE w:val="0"/>
+              <w:autoSpaceDN w:val="0"/>
+              <w:adjustRightInd w:val="0"/>
+              <w:spacing w:before="0" w:line="240" w:lineRule="auto"/>
+              <w:ind w:right="297"/>
+              <w:rPr>
+                <w:rFonts w:cs="Arial"/>
+                <w:b/>
+                <w:color w:val="000000"/>
+                <w:sz w:val="28"/>
+                <w:szCs w:val="32"/>
+                <w:lang w:val="it-IT"/>
+              </w:rPr>
+            </w:pPr>
+            <w:r>
+              <w:rPr>
+                <w:rFonts w:cs="Arial"/>
+                <w:b/>
+                <w:color w:val="000000"/>
+                <w:sz w:val="28"/>
+                <w:szCs w:val="28"/>
+                <w:lang w:val="it-IT"/>
+              </w:rPr>
+              <w:t xml:space="preserve">Panchaati No. - </w:t>
+            </w:r>
+            <w:r>
+              <w:rPr>
+                <w:rFonts w:cs="Arial"/>
+                <w:b/>
+                <w:color w:val="000000"/>
+                <w:sz w:val="28"/>
+                <w:szCs w:val="28"/>
+                <w:lang w:val="it-IT"/>
+              </w:rPr>
+              <w:t>4</w:t>
+            </w:r>
+            <w:r>
+              <w:rPr>
+                <w:rFonts w:cs="Arial"/>
+                <w:b/>
+                <w:color w:val="000000"/>
+                <w:sz w:val="28"/>
+                <w:szCs w:val="28"/>
+                <w:lang w:val="it-IT"/>
+              </w:rPr>
+              <w:t>7</w:t>
+            </w:r>
+          </w:p>
+        </w:tc>
+        <w:tc>
+          <w:tcPr>
+            <w:tcW w:w="5103" w:type="dxa"/>
+          </w:tcPr>
+          <w:p>
+            <w:pPr>
+              <w:widowControl w:val="0"/>
+              <w:autoSpaceDE w:val="0"/>
+              <w:autoSpaceDN w:val="0"/>
+              <w:adjustRightInd w:val="0"/>
+              <w:spacing w:before="0" w:line="240" w:lineRule="auto"/>
+              <w:rPr>
+                <w:rFonts w:ascii="BRH Malayalam Extra" w:hAnsi="BRH Malayalam Extra" w:cs="BRH Malayalam Extra"/>
+                <w:color w:val="000000"/>
+                <w:sz w:val="36"/>
+                <w:szCs w:val="40"/>
+              </w:rPr>
+            </w:pPr>
+            <w:r>
+              <w:rPr>
+                <w:rFonts w:ascii="BRH Malayalam Extra" w:eastAsia="Times New Roman" w:hAnsi="BRH Malayalam Extra" w:cs="BRH Malayalam Extra"/>
+                <w:color w:val="000000"/>
+                <w:sz w:val="40"/>
+                <w:szCs w:val="40"/>
+                <w:lang w:eastAsia="en-IN" w:bidi="ml-IN"/>
+              </w:rPr>
+              <w:t>ögÖ</w:t>
+            </w:r>
+            <w:r>
+              <w:rPr>
+                <w:rFonts w:ascii="BRH Malayalam Extra" w:eastAsia="Times New Roman" w:hAnsi="BRH Malayalam Extra" w:cs="BRH Malayalam Extra"/>
+                <w:color w:val="000000" w:themeColor="text1"/>
+                <w:sz w:val="40"/>
+                <w:szCs w:val="40"/>
+                <w:lang w:eastAsia="en-IN" w:bidi="ml-IN"/>
+              </w:rPr>
+              <w:t>—</w:t>
+            </w:r>
+            <w:r>
+              <w:rPr>
+                <w:rFonts w:ascii="BRH Malayalam Extra" w:eastAsia="Times New Roman" w:hAnsi="BRH Malayalam Extra" w:cs="BRH Malayalam Extra"/>
+                <w:color w:val="000000" w:themeColor="text1"/>
+                <w:sz w:val="40"/>
+                <w:szCs w:val="40"/>
+                <w:highlight w:val="yellow"/>
+                <w:lang w:eastAsia="en-IN" w:bidi="ml-IN"/>
+              </w:rPr>
+              <w:t>¤¤</w:t>
+            </w:r>
+            <w:r>
+              <w:rPr>
+                <w:rFonts w:ascii="BRH Malayalam Extra" w:eastAsia="Times New Roman" w:hAnsi="BRH Malayalam Extra" w:cs="BRH Malayalam Extra"/>
+                <w:color w:val="000000" w:themeColor="text1"/>
+                <w:sz w:val="40"/>
+                <w:szCs w:val="40"/>
+                <w:lang w:eastAsia="en-IN" w:bidi="ml-IN"/>
+              </w:rPr>
+              <w:t>Ë</w:t>
+            </w:r>
+            <w:r>
+              <w:rPr>
+                <w:rFonts w:ascii="BRH Malayalam Extra" w:eastAsia="Times New Roman" w:hAnsi="BRH Malayalam Extra" w:cs="BRH Malayalam Extra"/>
+                <w:color w:val="000000"/>
+                <w:sz w:val="32"/>
+                <w:szCs w:val="40"/>
+                <w:lang w:eastAsia="en-IN" w:bidi="ml-IN"/>
+              </w:rPr>
+              <w:t>–</w:t>
+            </w:r>
+            <w:r>
+              <w:rPr>
+                <w:rFonts w:ascii="BRH Malayalam Extra" w:eastAsia="Times New Roman" w:hAnsi="BRH Malayalam Extra" w:cs="BRH Malayalam Extra"/>
+                <w:color w:val="000000"/>
+                <w:sz w:val="40"/>
+                <w:szCs w:val="40"/>
+                <w:lang w:eastAsia="en-IN" w:bidi="ml-IN"/>
+              </w:rPr>
+              <w:t>p | G</w:t>
+            </w:r>
+            <w:r>
+              <w:rPr>
+                <w:rFonts w:ascii="BRH Malayalam Extra" w:eastAsia="Times New Roman" w:hAnsi="BRH Malayalam Extra" w:cs="BRH Malayalam Extra"/>
+                <w:color w:val="000000"/>
+                <w:sz w:val="32"/>
+                <w:szCs w:val="40"/>
+                <w:lang w:eastAsia="en-IN" w:bidi="ml-IN"/>
+              </w:rPr>
+              <w:t>–</w:t>
+            </w:r>
+            <w:r>
+              <w:rPr>
+                <w:rFonts w:ascii="BRH Malayalam Extra" w:eastAsia="Times New Roman" w:hAnsi="BRH Malayalam Extra" w:cs="BRH Malayalam Extra"/>
+                <w:color w:val="000000"/>
+                <w:sz w:val="40"/>
+                <w:szCs w:val="40"/>
+                <w:lang w:eastAsia="en-IN" w:bidi="ml-IN"/>
+              </w:rPr>
+              <w:t>¤¤pdx˜I |</w:t>
+            </w:r>
+          </w:p>
+        </w:tc>
+        <w:tc>
+          <w:tcPr>
+            <w:tcW w:w="5386" w:type="dxa"/>
+          </w:tcPr>
+          <w:p>
+            <w:pPr>
+              <w:widowControl w:val="0"/>
+              <w:autoSpaceDE w:val="0"/>
+              <w:autoSpaceDN w:val="0"/>
+              <w:adjustRightInd w:val="0"/>
+              <w:spacing w:before="0" w:line="240" w:lineRule="auto"/>
+              <w:rPr>
+                <w:rFonts w:ascii="Cambria" w:hAnsi="Cambria" w:cs="BRH Malayalam Extra"/>
+                <w:color w:val="000000"/>
+                <w:sz w:val="36"/>
+                <w:szCs w:val="40"/>
+              </w:rPr>
+            </w:pPr>
+            <w:r>
+              <w:rPr>
+                <w:rFonts w:ascii="BRH Malayalam Extra" w:eastAsia="Times New Roman" w:hAnsi="BRH Malayalam Extra" w:cs="BRH Malayalam Extra"/>
+                <w:color w:val="000000"/>
+                <w:sz w:val="40"/>
+                <w:szCs w:val="40"/>
+                <w:lang w:eastAsia="en-IN" w:bidi="ml-IN"/>
+              </w:rPr>
+              <w:t>ögÖ</w:t>
+            </w:r>
+            <w:r>
+              <w:rPr>
+                <w:rFonts w:ascii="BRH Malayalam Extra" w:eastAsia="Times New Roman" w:hAnsi="BRH Malayalam Extra" w:cs="BRH Malayalam Extra"/>
+                <w:color w:val="000000" w:themeColor="text1"/>
+                <w:sz w:val="40"/>
+                <w:szCs w:val="40"/>
+                <w:lang w:eastAsia="en-IN" w:bidi="ml-IN"/>
+              </w:rPr>
+              <w:t>—</w:t>
+            </w:r>
+            <w:r>
+              <w:rPr>
+                <w:rFonts w:ascii="BRH Malayalam Extra" w:eastAsia="Times New Roman" w:hAnsi="BRH Malayalam Extra" w:cs="BRH Malayalam Extra"/>
+                <w:color w:val="000000"/>
+                <w:sz w:val="40"/>
+                <w:szCs w:val="40"/>
+                <w:highlight w:val="green"/>
+                <w:lang w:eastAsia="en-IN" w:bidi="ml-IN"/>
+              </w:rPr>
+              <w:t>¥</w:t>
+            </w:r>
+            <w:r>
+              <w:rPr>
+                <w:rFonts w:ascii="BRH Malayalam Extra" w:eastAsia="Times New Roman" w:hAnsi="BRH Malayalam Extra" w:cs="BRH Malayalam Extra"/>
+                <w:color w:val="000000" w:themeColor="text1"/>
+                <w:sz w:val="40"/>
+                <w:szCs w:val="40"/>
+                <w:lang w:eastAsia="en-IN" w:bidi="ml-IN"/>
+              </w:rPr>
+              <w:t>Ë</w:t>
+            </w:r>
+            <w:r>
+              <w:rPr>
+                <w:rFonts w:ascii="BRH Malayalam Extra" w:eastAsia="Times New Roman" w:hAnsi="BRH Malayalam Extra" w:cs="BRH Malayalam Extra"/>
+                <w:color w:val="000000"/>
+                <w:sz w:val="32"/>
+                <w:szCs w:val="40"/>
+                <w:lang w:eastAsia="en-IN" w:bidi="ml-IN"/>
+              </w:rPr>
+              <w:t>–</w:t>
+            </w:r>
+            <w:r>
+              <w:rPr>
+                <w:rFonts w:ascii="BRH Malayalam Extra" w:eastAsia="Times New Roman" w:hAnsi="BRH Malayalam Extra" w:cs="BRH Malayalam Extra"/>
+                <w:color w:val="000000"/>
+                <w:sz w:val="40"/>
+                <w:szCs w:val="40"/>
+                <w:lang w:eastAsia="en-IN" w:bidi="ml-IN"/>
+              </w:rPr>
+              <w:t>p | G</w:t>
+            </w:r>
+            <w:r>
+              <w:rPr>
+                <w:rFonts w:ascii="BRH Malayalam Extra" w:eastAsia="Times New Roman" w:hAnsi="BRH Malayalam Extra" w:cs="BRH Malayalam Extra"/>
+                <w:color w:val="000000"/>
+                <w:sz w:val="32"/>
+                <w:szCs w:val="40"/>
+                <w:lang w:eastAsia="en-IN" w:bidi="ml-IN"/>
+              </w:rPr>
+              <w:t>–</w:t>
+            </w:r>
+            <w:r>
+              <w:rPr>
+                <w:rFonts w:ascii="BRH Malayalam Extra" w:eastAsia="Times New Roman" w:hAnsi="BRH Malayalam Extra" w:cs="BRH Malayalam Extra"/>
+                <w:color w:val="000000"/>
+                <w:sz w:val="40"/>
+                <w:szCs w:val="40"/>
+                <w:lang w:eastAsia="en-IN" w:bidi="ml-IN"/>
+              </w:rPr>
+              <w:t>¤¤pdx˜I |</w:t>
+            </w:r>
+          </w:p>
+        </w:tc>
+      </w:tr>
+    </w:tbl>
+    <w:p>
+      <w:pPr>
+        <w:jc w:val="center"/>
+        <w:rPr>
+          <w:b/>
+          <w:bCs/>
+          <w:sz w:val="32"/>
+          <w:szCs w:val="32"/>
+          <w:u w:val="single"/>
+        </w:rPr>
+      </w:pPr>
+    </w:p>
+    <w:p>
+      <w:pPr>
+        <w:jc w:val="center"/>
+        <w:rPr>
+          <w:b/>
+          <w:bCs/>
+          <w:sz w:val="32"/>
+          <w:szCs w:val="32"/>
+          <w:u w:val="single"/>
+        </w:rPr>
+      </w:pPr>
+    </w:p>
     <w:p>
       <w:pPr>
         <w:jc w:val="center"/>
@@ -796,6 +1395,7 @@
                 <w:sz w:val="28"/>
                 <w:szCs w:val="28"/>
               </w:rPr>
+              <w:lastRenderedPageBreak/>
               <w:t>T.S.5.1.2.</w:t>
             </w:r>
             <w:r>
@@ -2218,7 +2818,6 @@
                 <w:sz w:val="28"/>
                 <w:szCs w:val="28"/>
               </w:rPr>
-              <w:lastRenderedPageBreak/>
               <w:t>T.S.5.1.2.6 – Kramam</w:t>
             </w:r>
           </w:p>
@@ -2879,7 +3478,7 @@
                 <w:color w:val="EE0000"/>
                 <w:sz w:val="28"/>
                 <w:szCs w:val="28"/>
-                <w:lang w:val="it-IT" w:bidi="ta-IN"/>
+                <w:lang w:val="en-IN" w:bidi="ta-IN"/>
               </w:rPr>
             </w:pPr>
             <w:r>
@@ -2889,20 +3488,9 @@
                 <w:color w:val="EE0000"/>
                 <w:sz w:val="28"/>
                 <w:szCs w:val="28"/>
-                <w:lang w:val="it-IT"/>
-              </w:rPr>
-              <w:t xml:space="preserve">Krama Vaakyam No.– </w:t>
-            </w:r>
-            <w:r>
-              <w:rPr>
-                <w:rFonts w:cs="Arial"/>
-                <w:b/>
-                <w:color w:val="EE0000"/>
-                <w:sz w:val="28"/>
-                <w:szCs w:val="28"/>
-                <w:lang w:val="it-IT"/>
-              </w:rPr>
-              <w:t>31</w:t>
+                <w:lang w:val="en-IN"/>
+              </w:rPr>
+              <w:t>Krama Vaakyam No.– 31</w:t>
             </w:r>
           </w:p>
           <w:p>
@@ -3169,6 +3757,7 @@
                 <w:sz w:val="28"/>
                 <w:szCs w:val="28"/>
               </w:rPr>
+              <w:lastRenderedPageBreak/>
               <w:t>T.S.5.1.</w:t>
             </w:r>
             <w:r>
@@ -4474,7 +5063,6 @@
                 <w:sz w:val="28"/>
                 <w:szCs w:val="32"/>
               </w:rPr>
-              <w:lastRenderedPageBreak/>
               <w:t>T.S.</w:t>
             </w:r>
             <w:r>
@@ -5338,6 +5926,7 @@
           <w:szCs w:val="32"/>
           <w:u w:val="single"/>
         </w:rPr>
+        <w:lastRenderedPageBreak/>
         <w:t xml:space="preserve">TS Krama Paatam – TS </w:t>
       </w:r>
       <w:r>
@@ -6862,7 +7451,6 @@
                 <w:sz w:val="28"/>
                 <w:szCs w:val="32"/>
               </w:rPr>
-              <w:lastRenderedPageBreak/>
               <w:t>T.S.5.1.5.5 – Kramam</w:t>
             </w:r>
           </w:p>
@@ -7856,6 +8444,7 @@
                 <w:highlight w:val="yellow"/>
                 <w:lang w:val="it-IT" w:eastAsia="en-IN" w:bidi="ml-IN"/>
               </w:rPr>
+              <w:lastRenderedPageBreak/>
               <w:t>A</w:t>
             </w:r>
             <w:r>
@@ -8057,6 +8646,7 @@
                 <w:szCs w:val="40"/>
                 <w:lang w:val="it-IT" w:eastAsia="en-IN" w:bidi="ml-IN"/>
               </w:rPr>
+              <w:lastRenderedPageBreak/>
               <w:t>A</w:t>
             </w:r>
             <w:r>
@@ -8224,6 +8814,7 @@
                 <w:highlight w:val="green"/>
                 <w:lang w:val="it-IT" w:eastAsia="en-IN" w:bidi="ml-IN"/>
               </w:rPr>
+              <w:lastRenderedPageBreak/>
               <w:t>A</w:t>
             </w:r>
             <w:r>
@@ -8442,6 +9033,7 @@
                 <w:sz w:val="28"/>
                 <w:szCs w:val="32"/>
               </w:rPr>
+              <w:lastRenderedPageBreak/>
               <w:t>T.S.5.1.7.4 – Kramam</w:t>
             </w:r>
           </w:p>
@@ -9710,7 +10302,6 @@
                 <w:sz w:val="28"/>
                 <w:szCs w:val="32"/>
               </w:rPr>
-              <w:lastRenderedPageBreak/>
               <w:t>T.S.5.1.8.</w:t>
             </w:r>
             <w:r>
@@ -10682,6 +11273,7 @@
                 <w:sz w:val="28"/>
                 <w:szCs w:val="32"/>
               </w:rPr>
+              <w:lastRenderedPageBreak/>
               <w:t>T.S.</w:t>
             </w:r>
             <w:r>

</xml_diff>